<commit_message>
Adicionar exemplos de ACCORDION e FLIPCARD no documento de exemplo e renomear arquivo para exemplo-curso.docx
</commit_message>
<xml_diff>
--- a/public/roteiro/exemplo-curso-pizza.docx
+++ b/public/roteiro/exemplo-curso-pizza.docx
@@ -370,6 +370,310 @@
     <w:p>
       <w:r>
         <w:t xml:space="preserve">• Harmonize com uma cerveja gelada ou caipirinha de limão</w:t>
+      </w:r>
+    </w:p>
+    <w:p/>
+    <w:p>
+      <w:pPr>
+        <w:pStyle w:val="Heading2"/>
+      </w:pPr>
+      <w:r>
+        <w:t xml:space="preserve">💡 INDICADORES ESPECIAIS - Exemplo de ACCORDION</w:t>
+      </w:r>
+    </w:p>
+    <w:p>
+      <w:r>
+        <w:t xml:space="preserve">Para criar conteúdo expansível/colapsável (accordion), use os marcadores abaixo:</w:t>
+      </w:r>
+    </w:p>
+    <w:p/>
+    <w:p>
+      <w:r>
+        <w:rPr>
+          <w:b/>
+          <w:bCs/>
+        </w:rPr>
+        <w:t xml:space="preserve">ACCORDION_INICIO</w:t>
+      </w:r>
+    </w:p>
+    <w:p>
+      <w:r>
+        <w:rPr>
+          <w:b/>
+          <w:bCs/>
+        </w:rPr>
+        <w:t xml:space="preserve">Título do Item 1: </w:t>
+      </w:r>
+      <w:r>
+        <w:t xml:space="preserve">Erros Comuns ao Preparar a Massa</w:t>
+      </w:r>
+    </w:p>
+    <w:p>
+      <w:r>
+        <w:rPr>
+          <w:b/>
+          <w:bCs/>
+        </w:rPr>
+        <w:t xml:space="preserve">Conteúdo do Item 1: </w:t>
+      </w:r>
+      <w:r>
+        <w:t xml:space="preserve">Usar água muito quente mata o fermento. Sempre use água em temperatura ambiente ou levemente morna. Sovar demais também pode deixar a massa dura. O ideal é sovar por 8-12 minutos até a massa ficar lisa e elástica, não mais do que isso.</w:t>
+      </w:r>
+    </w:p>
+    <w:p>
+      <w:r>
+        <w:rPr>
+          <w:b/>
+          <w:bCs/>
+        </w:rPr>
+        <w:t xml:space="preserve">Título do Item 2: </w:t>
+      </w:r>
+      <w:r>
+        <w:t xml:space="preserve">Temperaturas Ideais de Assamento</w:t>
+      </w:r>
+    </w:p>
+    <w:p>
+      <w:r>
+        <w:rPr>
+          <w:b/>
+          <w:bCs/>
+        </w:rPr>
+        <w:t xml:space="preserve">Conteúdo do Item 2: </w:t>
+      </w:r>
+      <w:r>
+        <w:t xml:space="preserve">A temperatura ideal para assar pizza artesanal é entre 280-300°C. Fornos domésticos geralmente atingem no máximo 250°C. Neste caso, aumente o tempo de assamento para 12-15 minutos e use a função grill nos últimos 2 minutos para dourar a borda.</w:t>
+      </w:r>
+    </w:p>
+    <w:p>
+      <w:r>
+        <w:rPr>
+          <w:b/>
+          <w:bCs/>
+        </w:rPr>
+        <w:t xml:space="preserve">Título do Item 3: </w:t>
+      </w:r>
+      <w:r>
+        <w:t xml:space="preserve">Como Armazenar Pizza Assada</w:t>
+      </w:r>
+    </w:p>
+    <w:p>
+      <w:r>
+        <w:rPr>
+          <w:b/>
+          <w:bCs/>
+        </w:rPr>
+        <w:t xml:space="preserve">Conteúdo do Item 3: </w:t>
+      </w:r>
+      <w:r>
+        <w:t xml:space="preserve">Pizza deve ser consumida imediatamente após o assamento para melhor sabor. Se precisar armazenar, congele crua antes de assar. Massa já assada pode ser congelada por até 1 mês e reaquecida em forno pré-aquecido por 5-7 minutos.</w:t>
+      </w:r>
+    </w:p>
+    <w:p>
+      <w:r>
+        <w:rPr>
+          <w:b/>
+          <w:bCs/>
+        </w:rPr>
+        <w:t xml:space="preserve">ACCORDION_FIM</w:t>
+      </w:r>
+    </w:p>
+    <w:p/>
+    <w:p>
+      <w:r>
+        <w:t xml:space="preserve">📝 OBSERVAÇÃO: A IA irá transformar o conteúdo entre ACCORDION_INICIO e ACCORDION_FIM em um accordion interativo com os itens criados.</w:t>
+      </w:r>
+    </w:p>
+    <w:p/>
+    <w:p>
+      <w:pPr>
+        <w:pStyle w:val="Heading2"/>
+      </w:pPr>
+      <w:r>
+        <w:t xml:space="preserve">💡 INDICADORES ESPECIAIS - Exemplo de FLIPCARD</w:t>
+      </w:r>
+    </w:p>
+    <w:p>
+      <w:r>
+        <w:t xml:space="preserve">Para criar cards interativos que podem ser girados (flip cards), use os marcadores abaixo:</w:t>
+      </w:r>
+    </w:p>
+    <w:p/>
+    <w:p>
+      <w:r>
+        <w:rPr>
+          <w:b/>
+          <w:bCs/>
+        </w:rPr>
+        <w:t xml:space="preserve">FLIPCARD_INICIO</w:t>
+      </w:r>
+    </w:p>
+    <w:p>
+      <w:r>
+        <w:rPr>
+          <w:b/>
+          <w:bCs/>
+        </w:rPr>
+        <w:t xml:space="preserve">Tipo de Frente: </w:t>
+      </w:r>
+      <w:r>
+        <w:t xml:space="preserve">titulo</w:t>
+      </w:r>
+    </w:p>
+    <w:p>
+      <w:r>
+        <w:rPr>
+          <w:b/>
+          <w:bCs/>
+        </w:rPr>
+        <w:t xml:space="preserve">Título da Frente: </w:t>
+      </w:r>
+      <w:r>
+        <w:t xml:space="preserve">Proporção Hidratação</w:t>
+      </w:r>
+    </w:p>
+    <w:p>
+      <w:r>
+        <w:rPr>
+          <w:b/>
+          <w:bCs/>
+        </w:rPr>
+        <w:t xml:space="preserve">Conteúdo do Verso: </w:t>
+      </w:r>
+      <w:r>
+        <w:t xml:space="preserve">A hidratação é o percentual de água em relação à farinha. Para pizza artesanal, recomenda-se 60-65% de hidratação. Isso significa: para 500g de farinha, use 300-325ml de água. Massas mais hidratadas (65%+) são mais fáceis de trabalhar e resultam em textura mais aerada, mas requerem mais prática para manusear. Massas menos hidratadas (60%) são mais fáceis de controlar, ideais para iniciantes.</w:t>
+      </w:r>
+    </w:p>
+    <w:p>
+      <w:r>
+        <w:rPr>
+          <w:b/>
+          <w:bCs/>
+        </w:rPr>
+        <w:t xml:space="preserve">FLIPCARD_FIM</w:t>
+      </w:r>
+    </w:p>
+    <w:p/>
+    <w:p>
+      <w:r>
+        <w:t xml:space="preserve">📝 OBSERVAÇÃO: A IA irá transformar o conteúdo entre FLIPCARD_INICIO e FLIPCARD_FIM em um card interativo. Tipos disponíveis: "titulo" (apenas título na frente), "imagem" (imagem na frente), "imagem-titulo" (imagem + título na frente).</w:t>
+      </w:r>
+    </w:p>
+    <w:p/>
+    <w:p>
+      <w:r>
+        <w:t xml:space="preserve">Exemplo de FlipCard com imagem e título:</w:t>
+      </w:r>
+    </w:p>
+    <w:p/>
+    <w:p>
+      <w:r>
+        <w:rPr>
+          <w:b/>
+          <w:bCs/>
+        </w:rPr>
+        <w:t xml:space="preserve">FLIPCARD_INICIO</w:t>
+      </w:r>
+    </w:p>
+    <w:p>
+      <w:r>
+        <w:rPr>
+          <w:b/>
+          <w:bCs/>
+        </w:rPr>
+        <w:t xml:space="preserve">Tipo de Frente: </w:t>
+      </w:r>
+      <w:r>
+        <w:t xml:space="preserve">imagem-titulo</w:t>
+      </w:r>
+    </w:p>
+    <w:p>
+      <w:r>
+        <w:rPr>
+          <w:b/>
+          <w:bCs/>
+        </w:rPr>
+        <w:t xml:space="preserve">Imagem da Frente: </w:t>
+      </w:r>
+      <w:r>
+        <w:t xml:space="preserve">[IMAGEM: Foto de uma pizza de carne de sol recém-assada com borda dourada]</w:t>
+      </w:r>
+    </w:p>
+    <w:p>
+      <w:r>
+        <w:rPr>
+          <w:b/>
+          <w:bCs/>
+        </w:rPr>
+        <w:t xml:space="preserve">Título da Frente: </w:t>
+      </w:r>
+      <w:r>
+        <w:t xml:space="preserve">Pizza Artesanal Pronta</w:t>
+      </w:r>
+    </w:p>
+    <w:p>
+      <w:r>
+        <w:rPr>
+          <w:b/>
+          <w:bCs/>
+        </w:rPr>
+        <w:t xml:space="preserve">Conteúdo do Verso: </w:t>
+      </w:r>
+      <w:r>
+        <w:t xml:space="preserve">Uma pizza artesanal bem feita apresenta: borda alta e dourada (resultado da fermentação adequada), base crocante mas não dura, distribuição uniforme dos ingredientes, e queijo derretido sem queimar. O segredo está na temperatura alta do forno (280-300°C) e no tempo de assamento curto (8-12 minutos), que preserva a umidade dos ingredientes enquanto cria a textura crocante desejada.</w:t>
+      </w:r>
+    </w:p>
+    <w:p>
+      <w:r>
+        <w:rPr>
+          <w:b/>
+          <w:bCs/>
+        </w:rPr>
+        <w:t xml:space="preserve">FLIPCARD_FIM</w:t>
+      </w:r>
+    </w:p>
+    <w:p/>
+    <w:p>
+      <w:r>
+        <w:t xml:space="preserve">---</w:t>
+      </w:r>
+    </w:p>
+    <w:p/>
+    <w:p>
+      <w:pPr>
+        <w:pStyle w:val="Heading1"/>
+      </w:pPr>
+      <w:r>
+        <w:t xml:space="preserve">📋 INSTRUÇÕES PARA USO DOS INDICADORES</w:t>
+      </w:r>
+    </w:p>
+    <w:p>
+      <w:r>
+        <w:t xml:space="preserve">• Use ACCORDION_INICIO e ACCORDION_FIM para criar conteúdo expansível</w:t>
+      </w:r>
+    </w:p>
+    <w:p>
+      <w:r>
+        <w:t xml:space="preserve">• Dentro do accordion, use "Título do Item X:" e "Conteúdo do Item X:" para cada item</w:t>
+      </w:r>
+    </w:p>
+    <w:p>
+      <w:r>
+        <w:t xml:space="preserve">• Use FLIPCARD_INICIO e FLIPCARD_FIM para criar cards interativos</w:t>
+      </w:r>
+    </w:p>
+    <w:p>
+      <w:r>
+        <w:t xml:space="preserve">• Especifique o Tipo de Frente: "titulo", "imagem" ou "imagem-titulo"</w:t>
+      </w:r>
+    </w:p>
+    <w:p>
+      <w:r>
+        <w:t xml:space="preserve">• Para imagens, use URLs ou [IMAGEM: descrição] para placeholders</w:t>
+      </w:r>
+    </w:p>
+    <w:p>
+      <w:r>
+        <w:t xml:space="preserve">• A IA processará esses marcadores e criará os componentes interativos automaticamente</w:t>
       </w:r>
     </w:p>
     <w:sectPr>

</xml_diff>